<commit_message>
Sample CSV download, Legal page, and no-sign-in user materials
Sample CSV: data/samples/sample_candidates.csv (ten fictional candidates in
every column the importer recognizes) is generated by standalone/build.py,
embedded in the app behind Download sample CSV buttons on the New search and
Help pages, and published on the site. It imports to the same ranking as the
JSON sample.

Legal page: the Legal and Sourcing Guide in the app's navigation, with a Word
download; the Help page links the Word user guide. Both .docx files ship with
the site.

No sign-in: user-facing text now points only to the GitHub site, which needs no
account. The Word user guide drops the claude.ai version; the claude.ai app is
marked not in use in the build notes.

Co-Authored-By: Claude Opus 5.5 <noreply@anthropic.com>
Claude-Session: https://claude.ai/code/session_0146Z9tNErhjp5bU39gamFw4
</commit_message>
<xml_diff>
--- a/docs/User_Guide.docx
+++ b/docs/User_Guide.docx
@@ -71,313 +71,87 @@
         <w:pStyle w:val="Heading1"/>
       </w:pPr>
       <w:r>
-        <w:t>Which version to use</w:t>
+        <w:t>Opening the app</w:t>
       </w:r>
-    </w:p>
-    <w:tbl>
-      <w:tblPr>
-        <w:tblW w:type="pct" w:w="5000"/>
-        <w:jc w:val="left"/>
-        <w:tblInd w:type="dxa" w:w="115"/>
-        <w:tblBorders>
-          <w:top w:val="single" w:sz="4" w:color="8A8F99"/>
-          <w:left w:val="nil" w:sz="4" w:color="8A8F99"/>
-          <w:bottom w:val="single" w:sz="4" w:color="8A8F99"/>
-          <w:right w:val="nil" w:sz="4" w:color="8A8F99"/>
-          <w:insideH w:val="single" w:sz="4" w:color="8A8F99"/>
-          <w:insideV w:val="nil" w:sz="4" w:color="8A8F99"/>
-        </w:tblBorders>
-        <w:tblLayout w:type="fixed"/>
-        <w:tblCellMar>
-          <w:top w:w="72" w:type="dxa"/>
-          <w:bottom w:w="72" w:type="dxa"/>
-          <w:left w:w="115" w:type="dxa"/>
-          <w:right w:w="115" w:type="dxa"/>
-        </w:tblCellMar>
-        <w:tblLook w:firstColumn="1" w:firstRow="1" w:lastColumn="0" w:lastRow="0" w:noHBand="0" w:noVBand="1" w:val="04A0"/>
-      </w:tblPr>
-      <w:tblGrid>
-        <w:gridCol w:w="1440"/>
-        <w:gridCol w:w="2880"/>
-        <w:gridCol w:w="2664"/>
-        <w:gridCol w:w="2376"/>
-      </w:tblGrid>
-      <w:tr>
-        <w:trPr>
-          <w:cantSplit w:val="true"/>
-          <w:tblHeader w:val="true"/>
-        </w:trPr>
-        <w:tc>
-          <w:tcPr>
-            <w:tcW w:type="dxa" w:w="1440"/>
-            <w:shd w:val="clear" w:color="auto" w:fill="171B22"/>
-          </w:tcPr>
-          <w:p>
-            <w:pPr>
-              <w:spacing w:before="0" w:after="0"/>
-            </w:pPr>
-            <w:r>
-              <w:rPr>
-                <w:rFonts w:ascii="JetBrains Mono" w:hAnsi="JetBrains Mono" w:cs="JetBrains Mono" w:eastAsia="JetBrains Mono"/>
-                <w:b w:val="0"/>
-                <w:color w:val="EEEDE7"/>
-                <w:sz w:val="18"/>
-              </w:rPr>
-              <w:t>VERSION</w:t>
-            </w:r>
-          </w:p>
-        </w:tc>
-        <w:tc>
-          <w:tcPr>
-            <w:tcW w:type="dxa" w:w="2880"/>
-            <w:shd w:val="clear" w:color="auto" w:fill="171B22"/>
-          </w:tcPr>
-          <w:p>
-            <w:pPr>
-              <w:spacing w:before="0" w:after="0"/>
-            </w:pPr>
-            <w:r>
-              <w:rPr>
-                <w:rFonts w:ascii="JetBrains Mono" w:hAnsi="JetBrains Mono" w:cs="JetBrains Mono" w:eastAsia="JetBrains Mono"/>
-                <w:b w:val="0"/>
-                <w:color w:val="EEEDE7"/>
-                <w:sz w:val="18"/>
-              </w:rPr>
-              <w:t>ADDRESS</w:t>
-            </w:r>
-          </w:p>
-        </w:tc>
-        <w:tc>
-          <w:tcPr>
-            <w:tcW w:type="dxa" w:w="2664"/>
-            <w:shd w:val="clear" w:color="auto" w:fill="171B22"/>
-          </w:tcPr>
-          <w:p>
-            <w:pPr>
-              <w:spacing w:before="0" w:after="0"/>
-            </w:pPr>
-            <w:r>
-              <w:rPr>
-                <w:rFonts w:ascii="JetBrains Mono" w:hAnsi="JetBrains Mono" w:cs="JetBrains Mono" w:eastAsia="JetBrains Mono"/>
-                <w:b w:val="0"/>
-                <w:color w:val="EEEDE7"/>
-                <w:sz w:val="18"/>
-              </w:rPr>
-              <w:t>WHERE YOUR WORK IS SAVED</w:t>
-            </w:r>
-          </w:p>
-        </w:tc>
-        <w:tc>
-          <w:tcPr>
-            <w:tcW w:type="dxa" w:w="2376"/>
-            <w:shd w:val="clear" w:color="auto" w:fill="171B22"/>
-          </w:tcPr>
-          <w:p>
-            <w:pPr>
-              <w:spacing w:before="0" w:after="0"/>
-            </w:pPr>
-            <w:r>
-              <w:rPr>
-                <w:rFonts w:ascii="JetBrains Mono" w:hAnsi="JetBrains Mono" w:cs="JetBrains Mono" w:eastAsia="JetBrains Mono"/>
-                <w:b w:val="0"/>
-                <w:color w:val="EEEDE7"/>
-                <w:sz w:val="18"/>
-              </w:rPr>
-              <w:t>CLAUDE SCORING</w:t>
-            </w:r>
-          </w:p>
-        </w:tc>
-      </w:tr>
-      <w:tr>
-        <w:trPr>
-          <w:cantSplit w:val="true"/>
-        </w:trPr>
-        <w:tc>
-          <w:tcPr>
-            <w:tcW w:type="dxa" w:w="1440"/>
-          </w:tcPr>
-          <w:p>
-            <w:pPr>
-              <w:spacing w:before="0" w:after="0"/>
-              <w:jc w:val="left"/>
-            </w:pPr>
-            <w:r>
-              <w:rPr>
-                <w:rFonts w:ascii="Archivo" w:hAnsi="Archivo" w:cs="Archivo" w:eastAsia="Archivo"/>
-                <w:b w:val="0"/>
-                <w:color w:val="0B0D10"/>
-                <w:sz w:val="18"/>
-              </w:rPr>
-              <w:t>GitHub site</w:t>
-            </w:r>
-          </w:p>
-        </w:tc>
-        <w:tc>
-          <w:tcPr>
-            <w:tcW w:type="dxa" w:w="2880"/>
-          </w:tcPr>
-          <w:p>
-            <w:pPr>
-              <w:spacing w:before="0" w:after="0"/>
-              <w:jc w:val="left"/>
-            </w:pPr>
-            <w:r>
-              <w:rPr>
-                <w:rFonts w:ascii="Archivo" w:hAnsi="Archivo" w:cs="Archivo" w:eastAsia="Archivo"/>
-                <w:b w:val="0"/>
-                <w:color w:val="0B0D10"/>
-                <w:sz w:val="18"/>
-              </w:rPr>
-              <w:t>https://azjester.github.io/Talent-Acquisition-Agent/</w:t>
-            </w:r>
-          </w:p>
-        </w:tc>
-        <w:tc>
-          <w:tcPr>
-            <w:tcW w:type="dxa" w:w="2664"/>
-          </w:tcPr>
-          <w:p>
-            <w:pPr>
-              <w:spacing w:before="0" w:after="0"/>
-              <w:jc w:val="left"/>
-            </w:pPr>
-            <w:r>
-              <w:rPr>
-                <w:rFonts w:ascii="Archivo" w:hAnsi="Archivo" w:cs="Archivo" w:eastAsia="Archivo"/>
-                <w:b w:val="0"/>
-                <w:color w:val="0B0D10"/>
-                <w:sz w:val="18"/>
-              </w:rPr>
-              <w:t>In your browser on your computer. Nobody else sees it; share results with Export CSV.</w:t>
-            </w:r>
-          </w:p>
-        </w:tc>
-        <w:tc>
-          <w:tcPr>
-            <w:tcW w:type="dxa" w:w="2376"/>
-          </w:tcPr>
-          <w:p>
-            <w:pPr>
-              <w:spacing w:before="0" w:after="0"/>
-              <w:jc w:val="left"/>
-            </w:pPr>
-            <w:r>
-              <w:rPr>
-                <w:rFonts w:ascii="Archivo" w:hAnsi="Archivo" w:cs="Archivo" w:eastAsia="Archivo"/>
-                <w:b w:val="0"/>
-                <w:color w:val="0B0D10"/>
-                <w:sz w:val="18"/>
-              </w:rPr>
-              <w:t>Add your own Anthropic API key under Governance. Without one, the app ranks on signal-dictionary scores.</w:t>
-            </w:r>
-          </w:p>
-        </w:tc>
-      </w:tr>
-      <w:tr>
-        <w:trPr>
-          <w:cantSplit w:val="true"/>
-        </w:trPr>
-        <w:tc>
-          <w:tcPr>
-            <w:tcW w:type="dxa" w:w="1440"/>
-          </w:tcPr>
-          <w:p>
-            <w:pPr>
-              <w:spacing w:before="0" w:after="0"/>
-              <w:jc w:val="left"/>
-            </w:pPr>
-            <w:r>
-              <w:rPr>
-                <w:rFonts w:ascii="Archivo" w:hAnsi="Archivo" w:cs="Archivo" w:eastAsia="Archivo"/>
-                <w:b w:val="0"/>
-                <w:color w:val="0B0D10"/>
-                <w:sz w:val="18"/>
-              </w:rPr>
-              <w:t>claude.ai</w:t>
-            </w:r>
-          </w:p>
-        </w:tc>
-        <w:tc>
-          <w:tcPr>
-            <w:tcW w:type="dxa" w:w="2880"/>
-          </w:tcPr>
-          <w:p>
-            <w:pPr>
-              <w:spacing w:before="0" w:after="0"/>
-              <w:jc w:val="left"/>
-            </w:pPr>
-            <w:r>
-              <w:rPr>
-                <w:rFonts w:ascii="Archivo" w:hAnsi="Archivo" w:cs="Archivo" w:eastAsia="Archivo"/>
-                <w:b w:val="0"/>
-                <w:color w:val="0B0D10"/>
-                <w:sz w:val="18"/>
-              </w:rPr>
-              <w:t>https://claude.ai/artifact/CeR86Htyv2kzoCjuo5FpYE</w:t>
-            </w:r>
-          </w:p>
-        </w:tc>
-        <w:tc>
-          <w:tcPr>
-            <w:tcW w:type="dxa" w:w="2664"/>
-          </w:tcPr>
-          <w:p>
-            <w:pPr>
-              <w:spacing w:before="0" w:after="0"/>
-              <w:jc w:val="left"/>
-            </w:pPr>
-            <w:r>
-              <w:rPr>
-                <w:rFonts w:ascii="Archivo" w:hAnsi="Archivo" w:cs="Archivo" w:eastAsia="Archivo"/>
-                <w:b w:val="0"/>
-                <w:color w:val="0B0D10"/>
-                <w:sz w:val="18"/>
-              </w:rPr>
-              <w:t>Shared with everyone who has the link and access. Changing data needs Contributor access.</w:t>
-            </w:r>
-          </w:p>
-        </w:tc>
-        <w:tc>
-          <w:tcPr>
-            <w:tcW w:type="dxa" w:w="2376"/>
-          </w:tcPr>
-          <w:p>
-            <w:pPr>
-              <w:spacing w:before="0" w:after="0"/>
-              <w:jc w:val="left"/>
-            </w:pPr>
-            <w:r>
-              <w:rPr>
-                <w:rFonts w:ascii="Archivo" w:hAnsi="Archivo" w:cs="Archivo" w:eastAsia="Archivo"/>
-                <w:b w:val="0"/>
-                <w:color w:val="0B0D10"/>
-                <w:sz w:val="18"/>
-              </w:rPr>
-              <w:t>Uses your own Claude account. claude.ai asks you to allow it the first time.</w:t>
-            </w:r>
-          </w:p>
-        </w:tc>
-      </w:tr>
-    </w:tbl>
-    <w:p>
-      <w:pPr>
-        <w:spacing w:after="0"/>
-      </w:pPr>
     </w:p>
     <w:p>
       <w:r>
         <w:rPr>
           <w:rFonts w:ascii="Archivo" w:hAnsi="Archivo" w:cs="Archivo" w:eastAsia="Archivo"/>
         </w:rPr>
-        <w:t>Both versions have the same screens and steps. Use the GitHub site to work on your own, and the claude.ai version when the team needs to see the same searches and reviews.</w:t>
+        <w:t xml:space="preserve">Open </w:t>
+      </w:r>
+      <w:r>
+        <w:rPr>
+          <w:rFonts w:ascii="JetBrains Mono" w:hAnsi="JetBrains Mono" w:cs="JetBrains Mono" w:eastAsia="JetBrains Mono"/>
+          <w:b w:val="0"/>
+          <w:color w:val="0B0D10"/>
+          <w:sz w:val="19"/>
+        </w:rPr>
+        <w:t>https://azjester.github.io/Talent-Acquisition-Agent/</w:t>
+      </w:r>
+      <w:r>
+        <w:rPr>
+          <w:rFonts w:ascii="Archivo" w:hAnsi="Archivo" w:cs="Archivo" w:eastAsia="Archivo"/>
+        </w:rPr>
+        <w:t>. No sign-in or account is needed.</w:t>
       </w:r>
     </w:p>
     <w:p>
       <w:pPr>
-        <w:pStyle w:val="Heading1"/>
+        <w:pStyle w:val="ListBullet"/>
       </w:pPr>
       <w:r>
-        <w:t>Before you start</w:t>
+        <w:rPr>
+          <w:rFonts w:ascii="Archivo" w:hAnsi="Archivo" w:cs="Archivo" w:eastAsia="Archivo"/>
+          <w:b/>
+          <w:color w:val="0B0D10"/>
+        </w:rPr>
+        <w:t xml:space="preserve">Your work stays in your browser. </w:t>
+      </w:r>
+      <w:r>
+        <w:rPr>
+          <w:rFonts w:ascii="Archivo" w:hAnsi="Archivo" w:cs="Archivo" w:eastAsia="Archivo"/>
+        </w:rPr>
+        <w:t>Searches, reviews and settings are saved in the browser on your computer. Nobody else sees them, and nothing is uploaded to GitHub. Use the same browser each time, and share results with Export CSV.</w:t>
+      </w:r>
+    </w:p>
+    <w:p>
+      <w:pPr>
+        <w:pStyle w:val="ListBullet"/>
+      </w:pPr>
+      <w:r>
+        <w:rPr>
+          <w:rFonts w:ascii="Archivo" w:hAnsi="Archivo" w:cs="Archivo" w:eastAsia="Archivo"/>
+          <w:b/>
+          <w:color w:val="0B0D10"/>
+        </w:rPr>
+        <w:t xml:space="preserve">Light or dark mode. </w:t>
+      </w:r>
+      <w:r>
+        <w:rPr>
+          <w:rFonts w:ascii="Archivo" w:hAnsi="Archivo" w:cs="Archivo" w:eastAsia="Archivo"/>
+        </w:rPr>
+        <w:t>The button at the top right switches themes. The app remembers your choice.</w:t>
+      </w:r>
+    </w:p>
+    <w:p>
+      <w:pPr>
+        <w:pStyle w:val="ListBullet"/>
+      </w:pPr>
+      <w:r>
+        <w:rPr>
+          <w:rFonts w:ascii="Archivo" w:hAnsi="Archivo" w:cs="Archivo" w:eastAsia="Archivo"/>
+          <w:b/>
+          <w:color w:val="0B0D10"/>
+        </w:rPr>
+        <w:t xml:space="preserve">Help and Legal pages. </w:t>
+      </w:r>
+      <w:r>
+        <w:rPr>
+          <w:rFonts w:ascii="Archivo" w:hAnsi="Archivo" w:cs="Archivo" w:eastAsia="Archivo"/>
+        </w:rPr>
+        <w:t>Help repeats these steps inside the app. Legal summarizes the sourcing rules, and both pages offer the Word versions.</w:t>
       </w:r>
     </w:p>
     <w:p>
@@ -385,7 +159,15 @@
         <w:pStyle w:val="Heading2"/>
       </w:pPr>
       <w:r>
-        <w:t>GitHub site</w:t>
+        <w:t>Optional: turn on Claude scoring</w:t>
+      </w:r>
+    </w:p>
+    <w:p>
+      <w:r>
+        <w:rPr>
+          <w:rFonts w:ascii="Archivo" w:hAnsi="Archivo" w:cs="Archivo" w:eastAsia="Archivo"/>
+        </w:rPr>
+        <w:t>The app works without Claude, ranking candidates with its built-in signal dictionary. Claude scoring reads each profile more closely and needs an Anthropic API key.</w:t>
       </w:r>
     </w:p>
     <w:p>
@@ -407,22 +189,7 @@
         <w:rPr>
           <w:rFonts w:ascii="Archivo" w:hAnsi="Archivo" w:cs="Archivo" w:eastAsia="Archivo"/>
         </w:rPr>
-        <w:t xml:space="preserve">Open </w:t>
-      </w:r>
-      <w:r>
-        <w:rPr>
-          <w:rFonts w:ascii="JetBrains Mono" w:hAnsi="JetBrains Mono" w:cs="JetBrains Mono" w:eastAsia="JetBrains Mono"/>
-          <w:b w:val="0"/>
-          <w:color w:val="0B0D10"/>
-          <w:sz w:val="19"/>
-        </w:rPr>
-        <w:t>https://azjester.github.io/Talent-Acquisition-Agent/</w:t>
-      </w:r>
-      <w:r>
-        <w:rPr>
-          <w:rFonts w:ascii="Archivo" w:hAnsi="Archivo" w:cs="Archivo" w:eastAsia="Archivo"/>
-        </w:rPr>
-        <w:t>. Use the same browser each time; your work is saved in it.</w:t>
+        <w:t>Sign in at console.anthropic.com, open API Keys, create a key, and set a monthly spending limit under Billing.</w:t>
       </w:r>
     </w:p>
     <w:p>
@@ -438,28 +205,6 @@
           <w:rFonts w:ascii="Archivo" w:hAnsi="Archivo" w:cs="Archivo" w:eastAsia="Archivo"/>
         </w:rPr>
         <w:t>2.</w:t>
-        <w:tab/>
-      </w:r>
-      <w:r>
-        <w:rPr>
-          <w:rFonts w:ascii="Archivo" w:hAnsi="Archivo" w:cs="Archivo" w:eastAsia="Archivo"/>
-        </w:rPr>
-        <w:t>Optional: get an Anthropic API key. Sign in at console.anthropic.com, open API Keys, create a key, and set a monthly spending limit under Billing.</w:t>
-      </w:r>
-    </w:p>
-    <w:p>
-      <w:pPr>
-        <w:tabs>
-          <w:tab w:pos="432" w:val="left"/>
-        </w:tabs>
-        <w:spacing w:after="80"/>
-        <w:ind w:left="432" w:hanging="432"/>
-      </w:pPr>
-      <w:r>
-        <w:rPr>
-          <w:rFonts w:ascii="Archivo" w:hAnsi="Archivo" w:cs="Archivo" w:eastAsia="Archivo"/>
-        </w:rPr>
-        <w:t>3.</w:t>
         <w:tab/>
       </w:r>
       <w:r>
@@ -495,117 +240,6 @@
           <w:rFonts w:ascii="Archivo" w:hAnsi="Archivo" w:cs="Archivo" w:eastAsia="Archivo"/>
         </w:rPr>
         <w:t>. Tick "Remember on this computer" to keep it after you close the tab. The key is stored only in your browser and sent only to Anthropic.</w:t>
-      </w:r>
-    </w:p>
-    <w:p>
-      <w:pPr>
-        <w:pStyle w:val="Heading2"/>
-      </w:pPr>
-      <w:r>
-        <w:t>claude.ai version</w:t>
-      </w:r>
-    </w:p>
-    <w:p>
-      <w:pPr>
-        <w:tabs>
-          <w:tab w:pos="432" w:val="left"/>
-        </w:tabs>
-        <w:spacing w:after="80"/>
-        <w:ind w:left="432" w:hanging="432"/>
-      </w:pPr>
-      <w:r>
-        <w:rPr>
-          <w:rFonts w:ascii="Archivo" w:hAnsi="Archivo" w:cs="Archivo" w:eastAsia="Archivo"/>
-        </w:rPr>
-        <w:t>1.</w:t>
-        <w:tab/>
-      </w:r>
-      <w:r>
-        <w:rPr>
-          <w:rFonts w:ascii="Archivo" w:hAnsi="Archivo" w:cs="Archivo" w:eastAsia="Archivo"/>
-        </w:rPr>
-        <w:t>Ask the owner to share the app with you as a Contributor (Share menu).</w:t>
-      </w:r>
-    </w:p>
-    <w:p>
-      <w:pPr>
-        <w:tabs>
-          <w:tab w:pos="432" w:val="left"/>
-        </w:tabs>
-        <w:spacing w:after="80"/>
-        <w:ind w:left="432" w:hanging="432"/>
-      </w:pPr>
-      <w:r>
-        <w:rPr>
-          <w:rFonts w:ascii="Archivo" w:hAnsi="Archivo" w:cs="Archivo" w:eastAsia="Archivo"/>
-        </w:rPr>
-        <w:t>2.</w:t>
-        <w:tab/>
-      </w:r>
-      <w:r>
-        <w:rPr>
-          <w:rFonts w:ascii="Archivo" w:hAnsi="Archivo" w:cs="Archivo" w:eastAsia="Archivo"/>
-        </w:rPr>
-        <w:t xml:space="preserve">Open </w:t>
-      </w:r>
-      <w:r>
-        <w:rPr>
-          <w:rFonts w:ascii="JetBrains Mono" w:hAnsi="JetBrains Mono" w:cs="JetBrains Mono" w:eastAsia="JetBrains Mono"/>
-          <w:b w:val="0"/>
-          <w:color w:val="0B0D10"/>
-          <w:sz w:val="19"/>
-        </w:rPr>
-        <w:t>https://claude.ai/artifact/CeR86Htyv2kzoCjuo5FpYE</w:t>
-      </w:r>
-      <w:r>
-        <w:rPr>
-          <w:rFonts w:ascii="Archivo" w:hAnsi="Archivo" w:cs="Archivo" w:eastAsia="Archivo"/>
-        </w:rPr>
-        <w:t xml:space="preserve"> while signed in to claude.ai.</w:t>
-      </w:r>
-    </w:p>
-    <w:p>
-      <w:pPr>
-        <w:tabs>
-          <w:tab w:pos="432" w:val="left"/>
-        </w:tabs>
-        <w:spacing w:after="80"/>
-        <w:ind w:left="432" w:hanging="432"/>
-      </w:pPr>
-      <w:r>
-        <w:rPr>
-          <w:rFonts w:ascii="Archivo" w:hAnsi="Archivo" w:cs="Archivo" w:eastAsia="Archivo"/>
-        </w:rPr>
-        <w:t>3.</w:t>
-        <w:tab/>
-      </w:r>
-      <w:r>
-        <w:rPr>
-          <w:rFonts w:ascii="Archivo" w:hAnsi="Archivo" w:cs="Archivo" w:eastAsia="Archivo"/>
-        </w:rPr>
-        <w:t xml:space="preserve">The first time you score, draft a rubric or draft outreach, select </w:t>
-      </w:r>
-      <w:r>
-        <w:rPr>
-          <w:rFonts w:ascii="Archivo" w:hAnsi="Archivo" w:cs="Archivo" w:eastAsia="Archivo"/>
-          <w:b/>
-          <w:color w:val="0B0D10"/>
-        </w:rPr>
-        <w:t>Allow</w:t>
-      </w:r>
-      <w:r>
-        <w:rPr>
-          <w:rFonts w:ascii="Archivo" w:hAnsi="Archivo" w:cs="Archivo" w:eastAsia="Archivo"/>
-        </w:rPr>
-        <w:t xml:space="preserve"> when claude.ai asks to let the app use Claude.</w:t>
-      </w:r>
-    </w:p>
-    <w:p>
-      <w:r>
-        <w:rPr>
-          <w:rFonts w:ascii="Archivo" w:hAnsi="Archivo" w:cs="Archivo" w:eastAsia="Archivo"/>
-        </w:rPr>
-        <w:t>In either version, the button at the top right switches between light and dark mode. The app remembers your choice.</w:t>
       </w:r>
     </w:p>
     <w:p>
@@ -934,6 +568,28 @@
           <w:rFonts w:ascii="Archivo" w:hAnsi="Archivo" w:cs="Archivo" w:eastAsia="Archivo"/>
         </w:rPr>
         <w:t>Export the results as a CSV file, or export applicants from the ATS. JSON files from People Data Labs also work.</w:t>
+      </w:r>
+    </w:p>
+    <w:p>
+      <w:r>
+        <w:rPr>
+          <w:rFonts w:ascii="Archivo" w:hAnsi="Archivo" w:cs="Archivo" w:eastAsia="Archivo"/>
+        </w:rPr>
+        <w:t xml:space="preserve">To see the format, or to try the app first, select </w:t>
+      </w:r>
+      <w:r>
+        <w:rPr>
+          <w:rFonts w:ascii="Archivo" w:hAnsi="Archivo" w:cs="Archivo" w:eastAsia="Archivo"/>
+          <w:b/>
+          <w:color w:val="0B0D10"/>
+        </w:rPr>
+        <w:t>Download sample CSV</w:t>
+      </w:r>
+      <w:r>
+        <w:rPr>
+          <w:rFonts w:ascii="Archivo" w:hAnsi="Archivo" w:cs="Archivo" w:eastAsia="Archivo"/>
+        </w:rPr>
+        <w:t xml:space="preserve"> on the New search page or the Help page. It has ten fictional candidates in every recognized column.</w:t>
       </w:r>
     </w:p>
     <w:p>
@@ -2289,7 +1945,7 @@
         <w:rPr>
           <w:rFonts w:ascii="Archivo" w:hAnsi="Archivo" w:cs="Archivo" w:eastAsia="Archivo"/>
         </w:rPr>
-        <w:t xml:space="preserve"> on the search page. The file holds the ranking, every criterion score and quote, the flags and the review decisions. On the GitHub site, this is how you share results with the team.</w:t>
+        <w:t xml:space="preserve"> on the search page. The file holds the ranking, every criterion score and quote, the flags and the review decisions. This is how you share results with the team.</w:t>
       </w:r>
     </w:p>
     <w:p>
@@ -2545,7 +2201,7 @@
                 <w:color w:val="0B0D10"/>
                 <w:sz w:val="18"/>
               </w:rPr>
-              <w:t>GitHub site: no Score with Claude button, or "Claude scoring is off"</w:t>
+              <w:t>No Score with Claude button, or "Claude scoring is off"</w:t>
             </w:r>
           </w:p>
         </w:tc>
@@ -2565,7 +2221,7 @@
                 <w:color w:val="0B0D10"/>
                 <w:sz w:val="18"/>
               </w:rPr>
-              <w:t>Add an Anthropic API key under Governance</w:t>
+              <w:t>Add an Anthropic API key under Governance, or keep working with the built-in scores</w:t>
             </w:r>
           </w:p>
         </w:tc>
@@ -2590,7 +2246,7 @@
                 <w:color w:val="0B0D10"/>
                 <w:sz w:val="18"/>
               </w:rPr>
-              <w:t>GitHub site: "The Anthropic API key was rejected"</w:t>
+              <w:t>"The Anthropic API key was rejected"</w:t>
             </w:r>
           </w:p>
         </w:tc>
@@ -2635,7 +2291,7 @@
                 <w:color w:val="0B0D10"/>
                 <w:sz w:val="18"/>
               </w:rPr>
-              <w:t>GitHub site: my searches are gone</w:t>
+              <w:t>My searches are gone</w:t>
             </w:r>
           </w:p>
         </w:tc>
@@ -2680,7 +2336,7 @@
                 <w:color w:val="0B0D10"/>
                 <w:sz w:val="18"/>
               </w:rPr>
-              <w:t>claude.ai: no Score with Claude button</w:t>
+              <w:t>A colleague cannot see my search</w:t>
             </w:r>
           </w:p>
         </w:tc>
@@ -2700,52 +2356,7 @@
                 <w:color w:val="0B0D10"/>
                 <w:sz w:val="18"/>
               </w:rPr>
-              <w:t>You declined the permission prompt, or Claude is unavailable in this view. Reload and allow it</w:t>
-            </w:r>
-          </w:p>
-        </w:tc>
-      </w:tr>
-      <w:tr>
-        <w:trPr>
-          <w:cantSplit w:val="true"/>
-        </w:trPr>
-        <w:tc>
-          <w:tcPr>
-            <w:tcW w:type="dxa" w:w="3744"/>
-          </w:tcPr>
-          <w:p>
-            <w:pPr>
-              <w:spacing w:before="0" w:after="0"/>
-              <w:jc w:val="left"/>
-            </w:pPr>
-            <w:r>
-              <w:rPr>
-                <w:rFonts w:ascii="Archivo" w:hAnsi="Archivo" w:cs="Archivo" w:eastAsia="Archivo"/>
-                <w:b w:val="0"/>
-                <w:color w:val="0B0D10"/>
-                <w:sz w:val="18"/>
-              </w:rPr>
-              <w:t>claude.ai: a colleague sees an empty app</w:t>
-            </w:r>
-          </w:p>
-        </w:tc>
-        <w:tc>
-          <w:tcPr>
-            <w:tcW w:type="dxa" w:w="5616"/>
-          </w:tcPr>
-          <w:p>
-            <w:pPr>
-              <w:spacing w:before="0" w:after="0"/>
-              <w:jc w:val="left"/>
-            </w:pPr>
-            <w:r>
-              <w:rPr>
-                <w:rFonts w:ascii="Archivo" w:hAnsi="Archivo" w:cs="Archivo" w:eastAsia="Archivo"/>
-                <w:b w:val="0"/>
-                <w:color w:val="0B0D10"/>
-                <w:sz w:val="18"/>
-              </w:rPr>
-              <w:t>Share the app with them from the Share menu, and check they are signed in to claude.ai</w:t>
+              <w:t>Each person's work stays in their own browser. Send them the exported CSV</w:t>
             </w:r>
           </w:p>
         </w:tc>

</xml_diff>